<commit_message>
Correcciones de auditoría: métricas M2 veraces, tasa única 782,75, generadores reproducibles y QA numérico en CI
Co-Authored-By: Claude Fable 5 <noreply@anthropic.com>
</commit_message>
<xml_diff>
--- a/downloads/en_chile_2022_dea_description.docx
+++ b/downloads/en_chile_2022_dea_description.docx
@@ -53,6 +53,21 @@
           <w:sz w:val="24"/>
         </w:rPr>
         <w:t>This document describes the variables included in each database released in the English version of the 2022 Chilean Disaggregated Economic Accounts. The English files use the prefix en_ and the monetary variables are expressed in millions of 2022 U.S. dollars (MUSD). Employment is measured in thousands of workers per year.</w:t>
+      </w:r>
+    </w:p>
+    <w:p>
+      <w:r>
+        <w:t xml:space="preserve">Data cutoff date: July 30, 2026.</w:t>
+      </w:r>
+    </w:p>
+    <w:p>
+      <w:r>
+        <w:t xml:space="preserve">Monetary values in the English files (MUSD) are anchored to Chile's 2022 GDP in current U.S. dollars (~301,260 million USD); the conversion between the Spanish and English versions is 782.75 CLP per USD, the implicit rate of that anchoring. Aggregates correspond to value added at basic prices and are therefore not directly comparable with the Central Bank of Chile's GDP at market prices in pesos.</w:t>
+      </w:r>
+    </w:p>
+    <w:p>
+      <w:r>
+        <w:t xml:space="preserve">Location code 57 corresponds to the Rest of the World (external sector); it must be excluded when computing domestic aggregates.</w:t>
       </w:r>
     </w:p>
     <w:p>
@@ -408,6 +423,11 @@
       </w:r>
     </w:p>
     <w:p>
+      <w:r>
+        <w:t xml:space="preserve">Note: imports in this dataset correspond to the intermediate use of imported products (input purchases by producers). They do not include imports destined for final demand, so exports − imported_intermediate_inputs does not correspond to Chile's trade balance.</w:t>
+      </w:r>
+    </w:p>
+    <w:p>
       <w:pPr>
         <w:pStyle w:val="ListParagraph"/>
       </w:pPr>

</xml_diff>

<commit_message>
Actualiza citación del paper a la publicación BID con DOI (sitio, docx y paquetes de descarga)
Co-Authored-By: Claude Fable 5 <noreply@anthropic.com>
</commit_message>
<xml_diff>
--- a/downloads/en_chile_2022_dea_description.docx
+++ b/downloads/en_chile_2022_dea_description.docx
@@ -25,7 +25,7 @@
           <w:b w:val="0"/>
           <w:sz w:val="24"/>
         </w:rPr>
-        <w:t>CORFO-IDB collaboration prepared by Federico Huneeus and Miguel del Valle</w:t>
+        <w:t>CORFO-IDB collaboration prepared by Federico Huneeus and Miguel Del Valle</w:t>
       </w:r>
     </w:p>
     <w:p>
@@ -114,7 +114,7 @@
           <w:b w:val="0"/>
           <w:sz w:val="24"/>
         </w:rPr>
-        <w:t>Huneeus, F., &amp; del Valle, M. (2026). The Geographic and Sectoral Impact of Productivity. Unpublished manuscript.</w:t>
+        <w:t>Huneeus, F., &amp; Del Valle, M. (2026). The Geographic and Sectoral Impact of Productivity. Inter-American Development Bank. http://dx.doi.org/10.18235/0014477</w:t>
       </w:r>
     </w:p>
     <w:p>

</xml_diff>